<commit_message>
docs(paper): expand Literature Review into paragraph format with thematic subsections in LaTeX and Word manuscripts
</commit_message>
<xml_diff>
--- a/research_paper_sol/solaraeus_manuscript.docx
+++ b/research_paper_sol/solaraeus_manuscript.docx
@@ -1379,6 +1379,78 @@
           <w:sz w:val="17"/>
         </w:rPr>
         <w:t>Table 1. Systematic literature review of microclimate modeling, GPU acceleration, and optimization frameworks.</w:t>
+      </w:r>
+    </w:p>
+    <w:p>
+      <w:pPr>
+        <w:pStyle w:val="Heading2"/>
+      </w:pPr>
+      <w:r>
+        <w:rPr>
+          <w:b/>
+          <w:color w:val="003366"/>
+          <w:sz w:val="22"/>
+        </w:rPr>
+        <w:t>2.1 Radiative Transfer Modeling and Decoupled Microclimate Engines</w:t>
+      </w:r>
+    </w:p>
+    <w:p>
+      <w:r>
+        <w:t>Urban microclimate simulation has traditionally relied on coupled atmospheric and computational fluid dynamics (CFD) formulations, such as ENVI-met (Bruse and Fleer 1998) or the LES-based PALM-4U model evaluated by Eingrüber et al. (2025) across Berlin street canyons. While physically comprehensive, Navier–Stokes fluid modeling imposes heavy computational penalties, frequently consuming hours of multi-core CPU cluster time per diurnal cycle and rendering iterative architectural exploration prohibitive (Krayenhoff et al. 2021). To alleviate this overhead, decoupled radiation engines have emerged as the standard paradigm for pedestrian thermal comfort assessment. By decoupling shortwave and longwave radiative flux calculations from convective fluid motion, the Solar and Longwave Environmental Irradiance Geometry (SOLWEIG) engine (Lindberg et al. 2008, 2018) estimates human radiant exposure at sub-meter spatial resolutions in seconds. Recent investigations have extended decoupled ray tracing to direct solar shading of building envelopes (Rayegan et al. 2025), urban canyon microclimate coupling (Bourquin et al. 2025), retro-reflective pavement modeling (Yuan et al. 2025), and vegetative cooling assessments (Chen et al. 2024; Baia et al. 2026). However, existing decoupled simulation engines operate strictly on monolithic batch principles: whenever a localized intervention—such as an overhead fabric canopy or tree planter—is placed within the urban corridor, the solver discards all precomputed spatial states and recomputes the entire digital twin from scratch, ignoring spatial sparsity and bounding properties.</w:t>
+      </w:r>
+    </w:p>
+    <w:p>
+      <w:pPr>
+        <w:pStyle w:val="Heading2"/>
+      </w:pPr>
+      <w:r>
+        <w:rPr>
+          <w:b/>
+          <w:color w:val="003366"/>
+          <w:sz w:val="22"/>
+        </w:rPr>
+        <w:t>2.2 GPU Acceleration and Precomputed Transport Architectures</w:t>
+      </w:r>
+    </w:p>
+    <w:p>
+      <w:r>
+        <w:t>To accelerate high-resolution microclimatic calculations, recent literature has increasingly turned to massively parallel graphical processing unit (GPU) computing. Kamath et al. (2026) developed SOLWEIG-GPU, achieving substantial runtime reductions for city-scale digital twins by parallelizing discrete ray marching and shadow casting on CUDA architectures. Similarly, Mei et al. (2025) presented GUST1.0, a GPU-accelerated energy balance engine that expedites 3D surface temperature modeling across complex building geometries, while parallel geospatial algorithms in Earth informatics have demonstrated significant efficiency gains for multicriteria urban analysis (Nguyen et al. 2023). Beyond direct ray tracing, precomputed radiative transfer techniques have been adapted from computer graphics to thermal simulation. Freude et al. (2023, 2025) formulated precomputed radiative transport matrices to simulate dynamic longwave and shortwave exchanges and solve inverse thermal material problems at interactive frame rates. Nonetheless, precomputation approaches suffer from a fundamental architectural limitation: they assume stationary geometric boundary conditions. The introduction of even a single localized shading canopy alters the geometric horizon and view-factor relationships, invalidating the precomputed transport matrices and necessitating an expensive full-domain rebuild. Crucially, prior GPU frameworks accelerate full-domain recomputation rather than formulating incremental reuse mechanisms.</w:t>
+      </w:r>
+    </w:p>
+    <w:p>
+      <w:pPr>
+        <w:pStyle w:val="Heading2"/>
+      </w:pPr>
+      <w:r>
+        <w:rPr>
+          <w:b/>
+          <w:color w:val="003366"/>
+          <w:sz w:val="22"/>
+        </w:rPr>
+        <w:t>2.3 Machine Learning Surrogates and Active Optimization</w:t>
+      </w:r>
+    </w:p>
+    <w:p>
+      <w:r>
+        <w:t>Recognizing the computational friction of physics-based solvers, researchers have extensively explored machine learning surrogates for urban heat island mitigation and microclimatic planning (Tao et al. 2025; Do et al. 2024). Deep learning surrogate architectures, such as the localized Fourier Neural Operators developed by Qin et al. (2024), map geometric and atmospheric boundary conditions to full 3D microclimate fields in milliseconds. However, machine learning surrogates introduce two severe limitations in design workflows: first, black-box neural networks lack certified, closed-form physical error bounds, making them prone to uncertified extrapolation errors when evaluating novel intervention shapes or extreme heatwave meteorology (Tao et al. 2025); second, static surrogates trained on fixed design distributions exhibit sharp accuracy degradation in dense canyon environments where sharp shadow discontinuities dominate. While Bayesian active learning frameworks can iteratively refine surrogate fidelity by balancing exploitation and exploration, their practical deployment requires an underlying physical simulation engine capable of evaluating proposed interventions with sub-second latency and guaranteed numerical parity.</w:t>
+      </w:r>
+    </w:p>
+    <w:p>
+      <w:pPr>
+        <w:pStyle w:val="Heading2"/>
+      </w:pPr>
+      <w:r>
+        <w:rPr>
+          <w:b/>
+          <w:color w:val="003366"/>
+          <w:sz w:val="22"/>
+        </w:rPr>
+        <w:t>2.4 Identified Research Gap</w:t>
+      </w:r>
+    </w:p>
+    <w:p>
+      <w:r>
+        <w:t>A synthesis of the surveyed literature reveals a critical methodological gap at the intersection of microclimate simulation and computational urban design. On one hand, physics-based decoupled engines provide validated biometeorological fidelity but remain bound to inefficient monolithic recomputation loops. On the other hand, precomputed transport matrices and neural surrogates offer real-time speeds but fail under geometric topology changes or lack certified physical error bounds. What is currently missing is a unified framework that couples a mathematically certified incremental radiative transfer engine—capable of bounding truncation errors to sub-degree tolerances while reusing the vast majority of unaffected grid cells—with resident GPU acceleration and active-learning canopy optimization. Solaraeus is engineered specifically to bridge this gap.</w:t>
       </w:r>
     </w:p>
     <w:p>

</xml_diff>

<commit_message>
docs(paper): update author block to two-column format with Ayush Singh and Dr. Jobin Thomas
</commit_message>
<xml_diff>
--- a/research_paper_sol/solaraeus_manuscript.docx
+++ b/research_paper_sol/solaraeus_manuscript.docx
@@ -26,7 +26,7 @@
           <w:b/>
           <w:sz w:val="24"/>
         </w:rPr>
-        <w:t>Ayush Singh</w:t>
+        <w:t>Ayush Singh  |  Dr. Jobin Thomas</w:t>
       </w:r>
     </w:p>
     <w:p>
@@ -40,9 +40,9 @@
           <w:color w:val="444444"/>
           <w:sz w:val="19"/>
         </w:rPr>
-        <w:t>Department of Data Science and Engineering, Computational Urban Climate Research Initiative</w:t>
+        <w:t>Department of Computational Science and Engineering (Data Science)</w:t>
         <w:br/>
-        <w:t>Academic Research Laboratory for Geospatial Informatics</w:t>
+        <w:t>Dayananda Sagar University, Bengaluru, Karnataka, India</w:t>
       </w:r>
     </w:p>
     <w:p>

</xml_diff>